<commit_message>
Add LAB8 bao cao
</commit_message>
<xml_diff>
--- a/LAB8/BuiTheAnh_1250080004_Bai_4_Cho_thue_van_phong_cao_oc.docx
+++ b/LAB8/BuiTheAnh_1250080004_Bai_4_Cho_thue_van_phong_cao_oc.docx
@@ -66,7 +66,19 @@
         <w:spacing w:after="60"/>
       </w:pPr>
       <w:r>
-        <w:t>Họ và tên: ………………………………………     MSSV: …………………</w:t>
+        <w:t>Họ và tên: ……</w:t>
+      </w:r>
+      <w:r>
+        <w:t>Bùi Thế Anh</w:t>
+      </w:r>
+      <w:r>
+        <w:t>……………………     MSSV: ………</w:t>
+      </w:r>
+      <w:r>
+        <w:t>1250080004</w:t>
+      </w:r>
+      <w:r>
+        <w:t>…………</w:t>
       </w:r>
     </w:p>
     <w:p>
@@ -74,7 +86,28 @@
         <w:spacing w:after="60"/>
       </w:pPr>
       <w:r>
-        <w:t>Lớp: ……………………     Nhóm TH: ……………     Ngày: …… / …… / ………</w:t>
+        <w:t>Lớp: ……</w:t>
+      </w:r>
+      <w:r>
+        <w:t>12_CNPM1</w:t>
+      </w:r>
+      <w:r>
+        <w:t>………    Nhóm TH: ……………     Ngày: …</w:t>
+      </w:r>
+      <w:r>
+        <w:t>30</w:t>
+      </w:r>
+      <w:r>
+        <w:t>… / …</w:t>
+      </w:r>
+      <w:r>
+        <w:t>10</w:t>
+      </w:r>
+      <w:r>
+        <w:t>… / …</w:t>
+      </w:r>
+      <w:r>
+        <w:t>2026</w:t>
       </w:r>
     </w:p>
     <w:p>
@@ -5576,6 +5609,9 @@
         <w:spacing w:line="320" w:lineRule="auto"/>
       </w:pPr>
       <w:r>
+        <w:rPr>
+          <w:noProof/>
+        </w:rPr>
         <w:drawing>
           <wp:inline distT="0" distB="0" distL="0" distR="0" wp14:anchorId="65B20A1F" wp14:editId="443905D0">
             <wp:extent cx="5939790" cy="3214370"/>
@@ -6020,6 +6056,7 @@
       <w:r>
         <w:rPr>
           <w:b/>
+          <w:noProof/>
           <w:szCs w:val="22"/>
         </w:rPr>
         <w:lastRenderedPageBreak/>
@@ -6067,6 +6104,7 @@
       </w:r>
       <w:r>
         <w:rPr>
+          <w:noProof/>
           <w:szCs w:val="22"/>
         </w:rPr>
         <w:drawing>
@@ -6117,24 +6155,14 @@
       <w:r>
         <w:t xml:space="preserve">Hinh Kiểm thử </w:t>
       </w:r>
-      <w:r>
-        <w:fldChar w:fldCharType="begin"/>
-      </w:r>
-      <w:r>
-        <w:instrText xml:space="preserve"> SEQ Hinh_Kiểm_thử \* ARABIC </w:instrText>
-      </w:r>
-      <w:r>
-        <w:fldChar w:fldCharType="separate"/>
-      </w:r>
-      <w:r>
-        <w:rPr>
-          <w:noProof/>
-        </w:rPr>
-        <w:t>1</w:t>
-      </w:r>
-      <w:r>
-        <w:fldChar w:fldCharType="end"/>
-      </w:r>
+      <w:fldSimple w:instr=" SEQ Hinh_Kiểm_thử \* ARABIC ">
+        <w:r>
+          <w:rPr>
+            <w:noProof/>
+          </w:rPr>
+          <w:t>1</w:t>
+        </w:r>
+      </w:fldSimple>
       <w:r>
         <w:t xml:space="preserve"> </w:t>
       </w:r>
@@ -6322,6 +6350,7 @@
       </w:pPr>
       <w:r>
         <w:rPr>
+          <w:noProof/>
           <w:szCs w:val="22"/>
         </w:rPr>
         <w:drawing>
@@ -6368,6 +6397,7 @@
       </w:pPr>
       <w:r>
         <w:rPr>
+          <w:noProof/>
           <w:szCs w:val="22"/>
         </w:rPr>
         <w:drawing>
@@ -6418,24 +6448,14 @@
       <w:r>
         <w:t xml:space="preserve">Hinh Kiểm thử </w:t>
       </w:r>
-      <w:r>
-        <w:fldChar w:fldCharType="begin"/>
-      </w:r>
-      <w:r>
-        <w:instrText xml:space="preserve"> SEQ Hinh_Kiểm_thử \* ARABIC </w:instrText>
-      </w:r>
-      <w:r>
-        <w:fldChar w:fldCharType="separate"/>
-      </w:r>
-      <w:r>
-        <w:rPr>
-          <w:noProof/>
-        </w:rPr>
-        <w:t>2</w:t>
-      </w:r>
-      <w:r>
-        <w:fldChar w:fldCharType="end"/>
-      </w:r>
+      <w:fldSimple w:instr=" SEQ Hinh_Kiểm_thử \* ARABIC ">
+        <w:r>
+          <w:rPr>
+            <w:noProof/>
+          </w:rPr>
+          <w:t>2</w:t>
+        </w:r>
+      </w:fldSimple>
       <w:r>
         <w:t xml:space="preserve"> </w:t>
       </w:r>
@@ -6634,6 +6654,7 @@
       </w:pPr>
       <w:r>
         <w:rPr>
+          <w:noProof/>
           <w:szCs w:val="22"/>
         </w:rPr>
         <w:drawing>
@@ -6684,24 +6705,14 @@
       <w:r>
         <w:t xml:space="preserve">Hinh Kiểm thử </w:t>
       </w:r>
-      <w:r>
-        <w:fldChar w:fldCharType="begin"/>
-      </w:r>
-      <w:r>
-        <w:instrText xml:space="preserve"> SEQ Hinh_Kiểm_thử \* ARABIC </w:instrText>
-      </w:r>
-      <w:r>
-        <w:fldChar w:fldCharType="separate"/>
-      </w:r>
-      <w:r>
-        <w:rPr>
-          <w:noProof/>
-        </w:rPr>
-        <w:t>3</w:t>
-      </w:r>
-      <w:r>
-        <w:fldChar w:fldCharType="end"/>
-      </w:r>
+      <w:fldSimple w:instr=" SEQ Hinh_Kiểm_thử \* ARABIC ">
+        <w:r>
+          <w:rPr>
+            <w:noProof/>
+          </w:rPr>
+          <w:t>3</w:t>
+        </w:r>
+      </w:fldSimple>
       <w:r>
         <w:t xml:space="preserve"> </w:t>
       </w:r>
@@ -6903,6 +6914,7 @@
       </w:pPr>
       <w:r>
         <w:rPr>
+          <w:noProof/>
           <w:szCs w:val="22"/>
         </w:rPr>
         <w:drawing>
@@ -6958,24 +6970,14 @@
       <w:r>
         <w:t xml:space="preserve">Hinh Kiểm thử </w:t>
       </w:r>
-      <w:r>
-        <w:fldChar w:fldCharType="begin"/>
-      </w:r>
-      <w:r>
-        <w:instrText xml:space="preserve"> SEQ Hinh_Kiểm_thử \* ARABIC </w:instrText>
-      </w:r>
-      <w:r>
-        <w:fldChar w:fldCharType="separate"/>
-      </w:r>
-      <w:r>
-        <w:rPr>
-          <w:noProof/>
-        </w:rPr>
-        <w:t>4</w:t>
-      </w:r>
-      <w:r>
-        <w:fldChar w:fldCharType="end"/>
-      </w:r>
+      <w:fldSimple w:instr=" SEQ Hinh_Kiểm_thử \* ARABIC ">
+        <w:r>
+          <w:rPr>
+            <w:noProof/>
+          </w:rPr>
+          <w:t>4</w:t>
+        </w:r>
+      </w:fldSimple>
       <w:r>
         <w:t xml:space="preserve"> </w:t>
       </w:r>
@@ -7182,6 +7184,7 @@
       </w:pPr>
       <w:r>
         <w:rPr>
+          <w:noProof/>
           <w:szCs w:val="22"/>
         </w:rPr>
         <w:drawing>
@@ -7232,39 +7235,30 @@
       <w:r>
         <w:t xml:space="preserve">Hinh Kiểm thử </w:t>
       </w:r>
-      <w:r>
-        <w:fldChar w:fldCharType="begin"/>
-      </w:r>
-      <w:r>
-        <w:instrText xml:space="preserve"> SEQ Hinh_Kiểm_thử \* ARABIC </w:instrText>
-      </w:r>
-      <w:r>
-        <w:fldChar w:fldCharType="separate"/>
-      </w:r>
+      <w:fldSimple w:instr=" SEQ Hinh_Kiểm_thử \* ARABIC ">
+        <w:r>
+          <w:rPr>
+            <w:noProof/>
+          </w:rPr>
+          <w:t>5</w:t>
+        </w:r>
+      </w:fldSimple>
+      <w:r>
+        <w:t xml:space="preserve"> </w:t>
+      </w:r>
+      <w:r>
+        <w:t>Kiểm thử từ chối thuê trùng lịch</w:t>
+      </w:r>
+    </w:p>
+    <w:p>
+      <w:pPr>
+        <w:keepNext/>
+        <w:spacing w:line="360" w:lineRule="auto"/>
+        <w:jc w:val="center"/>
+      </w:pPr>
       <w:r>
         <w:rPr>
           <w:noProof/>
-        </w:rPr>
-        <w:t>5</w:t>
-      </w:r>
-      <w:r>
-        <w:fldChar w:fldCharType="end"/>
-      </w:r>
-      <w:r>
-        <w:t xml:space="preserve"> </w:t>
-      </w:r>
-      <w:r>
-        <w:t>Kiểm thử từ chối thuê trùng lịch</w:t>
-      </w:r>
-    </w:p>
-    <w:p>
-      <w:pPr>
-        <w:keepNext/>
-        <w:spacing w:line="360" w:lineRule="auto"/>
-        <w:jc w:val="center"/>
-      </w:pPr>
-      <w:r>
-        <w:rPr>
           <w:szCs w:val="22"/>
         </w:rPr>
         <w:lastRenderedPageBreak/>
@@ -7321,24 +7315,14 @@
       <w:r>
         <w:t xml:space="preserve">Hinh Kiểm thử </w:t>
       </w:r>
-      <w:r>
-        <w:fldChar w:fldCharType="begin"/>
-      </w:r>
-      <w:r>
-        <w:instrText xml:space="preserve"> SEQ Hinh_Kiểm_thử \* ARABIC </w:instrText>
-      </w:r>
-      <w:r>
-        <w:fldChar w:fldCharType="separate"/>
-      </w:r>
-      <w:r>
-        <w:rPr>
-          <w:noProof/>
-        </w:rPr>
-        <w:t>6</w:t>
-      </w:r>
-      <w:r>
-        <w:fldChar w:fldCharType="end"/>
-      </w:r>
+      <w:fldSimple w:instr=" SEQ Hinh_Kiểm_thử \* ARABIC ">
+        <w:r>
+          <w:rPr>
+            <w:noProof/>
+          </w:rPr>
+          <w:t>6</w:t>
+        </w:r>
+      </w:fldSimple>
       <w:r>
         <w:t xml:space="preserve"> </w:t>
       </w:r>
@@ -7538,6 +7522,7 @@
       </w:pPr>
       <w:r>
         <w:rPr>
+          <w:noProof/>
           <w:szCs w:val="22"/>
         </w:rPr>
         <w:lastRenderedPageBreak/>
@@ -7586,24 +7571,14 @@
       <w:r>
         <w:t xml:space="preserve">Hinh Kiểm thử </w:t>
       </w:r>
-      <w:r>
-        <w:fldChar w:fldCharType="begin"/>
-      </w:r>
-      <w:r>
-        <w:instrText xml:space="preserve"> SEQ Hinh_Kiểm_thử \* ARABIC </w:instrText>
-      </w:r>
-      <w:r>
-        <w:fldChar w:fldCharType="separate"/>
-      </w:r>
-      <w:r>
-        <w:rPr>
-          <w:noProof/>
-        </w:rPr>
-        <w:t>7</w:t>
-      </w:r>
-      <w:r>
-        <w:fldChar w:fldCharType="end"/>
-      </w:r>
+      <w:fldSimple w:instr=" SEQ Hinh_Kiểm_thử \* ARABIC ">
+        <w:r>
+          <w:rPr>
+            <w:noProof/>
+          </w:rPr>
+          <w:t>7</w:t>
+        </w:r>
+      </w:fldSimple>
       <w:r>
         <w:t xml:space="preserve"> </w:t>
       </w:r>
@@ -7800,6 +7775,7 @@
       </w:pPr>
       <w:r>
         <w:rPr>
+          <w:noProof/>
           <w:szCs w:val="22"/>
         </w:rPr>
         <w:lastRenderedPageBreak/>
@@ -7849,6 +7825,7 @@
       </w:pPr>
       <w:r>
         <w:rPr>
+          <w:noProof/>
           <w:szCs w:val="22"/>
         </w:rPr>
         <w:drawing>
@@ -7901,6 +7878,7 @@
       </w:pPr>
       <w:r>
         <w:rPr>
+          <w:noProof/>
           <w:szCs w:val="22"/>
         </w:rPr>
         <w:lastRenderedPageBreak/>
@@ -7952,24 +7930,14 @@
       <w:r>
         <w:t xml:space="preserve">Hinh Kiểm thử </w:t>
       </w:r>
-      <w:r>
-        <w:fldChar w:fldCharType="begin"/>
-      </w:r>
-      <w:r>
-        <w:instrText xml:space="preserve"> SEQ Hinh_Kiểm_thử \* ARABIC </w:instrText>
-      </w:r>
-      <w:r>
-        <w:fldChar w:fldCharType="separate"/>
-      </w:r>
-      <w:r>
-        <w:rPr>
-          <w:noProof/>
-        </w:rPr>
-        <w:t>8</w:t>
-      </w:r>
-      <w:r>
-        <w:fldChar w:fldCharType="end"/>
-      </w:r>
+      <w:fldSimple w:instr=" SEQ Hinh_Kiểm_thử \* ARABIC ">
+        <w:r>
+          <w:rPr>
+            <w:noProof/>
+          </w:rPr>
+          <w:t>8</w:t>
+        </w:r>
+      </w:fldSimple>
       <w:r>
         <w:t xml:space="preserve"> </w:t>
       </w:r>
@@ -8202,6 +8170,7 @@
       </w:pPr>
       <w:r>
         <w:rPr>
+          <w:noProof/>
           <w:szCs w:val="22"/>
         </w:rPr>
         <w:lastRenderedPageBreak/>
@@ -8251,6 +8220,7 @@
       </w:pPr>
       <w:r>
         <w:rPr>
+          <w:noProof/>
           <w:szCs w:val="22"/>
         </w:rPr>
         <w:drawing>
@@ -8299,6 +8269,7 @@
       </w:pPr>
       <w:r>
         <w:rPr>
+          <w:noProof/>
           <w:szCs w:val="22"/>
         </w:rPr>
         <w:lastRenderedPageBreak/>
@@ -8346,6 +8317,7 @@
       </w:pPr>
       <w:r>
         <w:rPr>
+          <w:noProof/>
           <w:szCs w:val="22"/>
         </w:rPr>
         <w:drawing>
@@ -8393,24 +8365,14 @@
       <w:r>
         <w:t xml:space="preserve">Hinh Kiểm thử </w:t>
       </w:r>
-      <w:r>
-        <w:fldChar w:fldCharType="begin"/>
-      </w:r>
-      <w:r>
-        <w:instrText xml:space="preserve"> SEQ Hinh_Kiểm_thử \* ARABIC </w:instrText>
-      </w:r>
-      <w:r>
-        <w:fldChar w:fldCharType="separate"/>
-      </w:r>
-      <w:r>
-        <w:rPr>
-          <w:noProof/>
-        </w:rPr>
-        <w:t>9</w:t>
-      </w:r>
-      <w:r>
-        <w:fldChar w:fldCharType="end"/>
-      </w:r>
+      <w:fldSimple w:instr=" SEQ Hinh_Kiểm_thử \* ARABIC ">
+        <w:r>
+          <w:rPr>
+            <w:noProof/>
+          </w:rPr>
+          <w:t>9</w:t>
+        </w:r>
+      </w:fldSimple>
       <w:r>
         <w:t xml:space="preserve"> </w:t>
       </w:r>
@@ -8604,7 +8566,7 @@
           <w:noProof/>
         </w:rPr>
         <w:drawing>
-          <wp:inline distT="0" distB="0" distL="0" distR="0" wp14:anchorId="75724D9A" wp14:editId="3876C287">
+          <wp:inline distT="0" distB="0" distL="0" distR="0" wp14:anchorId="75724D9A" wp14:editId="6C395D14">
             <wp:extent cx="5939790" cy="3885565"/>
             <wp:effectExtent l="0" t="0" r="3810" b="635"/>
             <wp:docPr id="928611885" name="Picture 6"/>
@@ -8664,24 +8626,14 @@
       <w:r>
         <w:t xml:space="preserve">Hinh Kiểm thử </w:t>
       </w:r>
-      <w:r>
-        <w:fldChar w:fldCharType="begin"/>
-      </w:r>
-      <w:r>
-        <w:instrText xml:space="preserve"> SEQ Hinh_Kiểm_thử \* ARABIC </w:instrText>
-      </w:r>
-      <w:r>
-        <w:fldChar w:fldCharType="separate"/>
-      </w:r>
-      <w:r>
-        <w:rPr>
-          <w:noProof/>
-        </w:rPr>
-        <w:t>10</w:t>
-      </w:r>
-      <w:r>
-        <w:fldChar w:fldCharType="end"/>
-      </w:r>
+      <w:fldSimple w:instr=" SEQ Hinh_Kiểm_thử \* ARABIC ">
+        <w:r>
+          <w:rPr>
+            <w:noProof/>
+          </w:rPr>
+          <w:t>10</w:t>
+        </w:r>
+      </w:fldSimple>
       <w:r>
         <w:t xml:space="preserve"> </w:t>
       </w:r>
@@ -8881,6 +8833,7 @@
       </w:pPr>
       <w:r>
         <w:rPr>
+          <w:noProof/>
           <w:szCs w:val="22"/>
         </w:rPr>
         <w:lastRenderedPageBreak/>
@@ -8932,24 +8885,14 @@
       <w:r>
         <w:t xml:space="preserve">Hinh Kiểm thử </w:t>
       </w:r>
-      <w:r>
-        <w:fldChar w:fldCharType="begin"/>
-      </w:r>
-      <w:r>
-        <w:instrText xml:space="preserve"> SEQ Hinh_Kiểm_thử \* ARABIC </w:instrText>
-      </w:r>
-      <w:r>
-        <w:fldChar w:fldCharType="separate"/>
-      </w:r>
-      <w:r>
-        <w:rPr>
-          <w:noProof/>
-        </w:rPr>
-        <w:t>11</w:t>
-      </w:r>
-      <w:r>
-        <w:fldChar w:fldCharType="end"/>
-      </w:r>
+      <w:fldSimple w:instr=" SEQ Hinh_Kiểm_thử \* ARABIC ">
+        <w:r>
+          <w:rPr>
+            <w:noProof/>
+          </w:rPr>
+          <w:t>11</w:t>
+        </w:r>
+      </w:fldSimple>
       <w:r>
         <w:t xml:space="preserve"> </w:t>
       </w:r>
@@ -9149,6 +9092,7 @@
       </w:pPr>
       <w:r>
         <w:rPr>
+          <w:noProof/>
           <w:szCs w:val="22"/>
         </w:rPr>
         <w:lastRenderedPageBreak/>
@@ -9200,24 +9144,14 @@
       <w:r>
         <w:t xml:space="preserve">Hinh Kiểm thử </w:t>
       </w:r>
-      <w:r>
-        <w:fldChar w:fldCharType="begin"/>
-      </w:r>
-      <w:r>
-        <w:instrText xml:space="preserve"> SEQ Hinh_Kiểm_thử \* ARABIC </w:instrText>
-      </w:r>
-      <w:r>
-        <w:fldChar w:fldCharType="separate"/>
-      </w:r>
-      <w:r>
-        <w:rPr>
-          <w:noProof/>
-        </w:rPr>
-        <w:t>12</w:t>
-      </w:r>
-      <w:r>
-        <w:fldChar w:fldCharType="end"/>
-      </w:r>
+      <w:fldSimple w:instr=" SEQ Hinh_Kiểm_thử \* ARABIC ">
+        <w:r>
+          <w:rPr>
+            <w:noProof/>
+          </w:rPr>
+          <w:t>12</w:t>
+        </w:r>
+      </w:fldSimple>
       <w:r>
         <w:t xml:space="preserve"> </w:t>
       </w:r>
@@ -9423,6 +9357,7 @@
       </w:pPr>
       <w:r>
         <w:rPr>
+          <w:noProof/>
           <w:szCs w:val="22"/>
         </w:rPr>
         <w:lastRenderedPageBreak/>
@@ -9472,6 +9407,7 @@
       </w:pPr>
       <w:r>
         <w:rPr>
+          <w:noProof/>
           <w:szCs w:val="22"/>
         </w:rPr>
         <w:drawing>
@@ -9520,6 +9456,7 @@
       </w:pPr>
       <w:r>
         <w:rPr>
+          <w:noProof/>
           <w:szCs w:val="22"/>
         </w:rPr>
         <w:lastRenderedPageBreak/>
@@ -10316,6 +10253,7 @@
   <w:style w:type="character" w:default="1" w:styleId="DefaultParagraphFont">
     <w:name w:val="Default Paragraph Font"/>
     <w:uiPriority w:val="1"/>
+    <w:semiHidden/>
     <w:unhideWhenUsed/>
   </w:style>
   <w:style w:type="table" w:default="1" w:styleId="TableNormal">

</xml_diff>